<commit_message>
Demo data under a placeholder company: Example Ltd, and Scanner Suite products
The demo contracts, clauses, playbook, seed workspace and guides named a real company and its
products. The Word files are edited in place (only the text changes, so their tracked changes
stay as they were), and the recorded AI answers are re-keyed to the renamed contracts, so every
demo still replays them exactly.

Co-Authored-By: Claude Opus 5.5 <noreply@anthropic.com>
</commit_message>
<xml_diff>
--- a/data/demo-files/Acme-Analytics-Platform-Agreement.docx
+++ b/data/demo-files/Acme-Analytics-Platform-Agreement.docx
@@ -84,7 +84,7 @@
           <w:b/>
           <w:bCs/>
         </w:rPr>
-        <w:t xml:space="preserve">PortSwigger Ltd</w:t>
+        <w:t xml:space="preserve">Example Ltd</w:t>
       </w:r>
       <w:r>
         <w:br/>
@@ -611,7 +611,7 @@
           <w:b/>
           <w:bCs/>
         </w:rPr>
-        <w:t xml:space="preserve">	Signed for PortSwigger Ltd</w:t>
+        <w:t xml:space="preserve">	Signed for Example Ltd</w:t>
       </w:r>
       <w:r>
         <w:br/>

</xml_diff>